<commit_message>
feat(data): update participant selection and template documents
</commit_message>
<xml_diff>
--- a/data/Themenlisten-Vorlagen/Themenliste_Auftragssteuerung und -koordination.docx
+++ b/data/Themenlisten-Vorlagen/Themenliste_Auftragssteuerung und -koordination.docx
@@ -1,6 +1,6 @@
 
 <file path=word/document.xml><?xml version="1.0" encoding="utf-8"?>
-<w:document xmlns:wpc="http://schemas.microsoft.com/office/word/2010/wordprocessingCanvas" xmlns:cx="http://schemas.microsoft.com/office/drawing/2014/chartex" xmlns:cx1="http://schemas.microsoft.com/office/drawing/2015/9/8/chartex" xmlns:cx2="http://schemas.microsoft.com/office/drawing/2015/10/21/chartex" xmlns:cx3="http://schemas.microsoft.com/office/drawing/2016/5/9/chartex" xmlns:cx4="http://schemas.microsoft.com/office/drawing/2016/5/10/chartex" xmlns:cx5="http://schemas.microsoft.com/office/drawing/2016/5/11/chartex" xmlns:cx6="http://schemas.microsoft.com/office/drawing/2016/5/12/chartex" xmlns:cx7="http://schemas.microsoft.com/office/drawing/2016/5/13/chartex" xmlns:cx8="http://schemas.microsoft.com/office/drawing/2016/5/14/chartex" xmlns:mc="http://schemas.openxmlformats.org/markup-compatibility/2006" xmlns:aink="http://schemas.microsoft.com/office/drawing/2016/ink" xmlns:am3d="http://schemas.microsoft.com/office/drawing/2017/model3d" xmlns:o="urn:schemas-microsoft-com:office:office" xmlns:oel="http://schemas.microsoft.com/office/2019/extlst" xmlns:r="http://schemas.openxmlformats.org/officeDocument/2006/relationships" xmlns:m="http://schemas.openxmlformats.org/officeDocument/2006/math" xmlns:v="urn:schemas-microsoft-com:vml" xmlns:wp14="http://schemas.microsoft.com/office/word/2010/wordprocessingDrawing" xmlns:wp="http://schemas.openxmlformats.org/drawingml/2006/wordprocessingDrawing" xmlns:w10="urn:schemas-microsoft-com:office:word" xmlns:w="http://schemas.openxmlformats.org/wordprocessingml/2006/main" xmlns:w14="http://schemas.microsoft.com/office/word/2010/wordml" xmlns:w15="http://schemas.microsoft.com/office/word/2012/wordml" xmlns:w16cex="http://schemas.microsoft.com/office/word/2018/wordml/cex" xmlns:w16cid="http://schemas.microsoft.com/office/word/2016/wordml/cid" xmlns:w16="http://schemas.microsoft.com/office/word/2018/wordml" xmlns:w16du="http://schemas.microsoft.com/office/word/2023/wordml/word16du" xmlns:w16sdtdh="http://schemas.microsoft.com/office/word/2020/wordml/sdtdatahash" xmlns:w16sdtfl="http://schemas.microsoft.com/office/word/2024/wordml/sdtformatlock" xmlns:w16se="http://schemas.microsoft.com/office/word/2015/wordml/symex" xmlns:wpg="http://schemas.microsoft.com/office/word/2010/wordprocessingGroup" xmlns:wpi="http://schemas.microsoft.com/office/word/2010/wordprocessingInk" xmlns:wne="http://schemas.microsoft.com/office/word/2006/wordml" xmlns:wps="http://schemas.microsoft.com/office/word/2010/wordprocessingShape" mc:Ignorable="w14 w15 w16se w16cid w16 w16cex w16sdtdh w16sdtfl w16du wp14">
+<w:document xmlns:wpc="http://schemas.microsoft.com/office/word/2010/wordprocessingCanvas" xmlns:cx="http://schemas.microsoft.com/office/drawing/2014/chartex" xmlns:cx1="http://schemas.microsoft.com/office/drawing/2015/9/8/chartex" xmlns:cx2="http://schemas.microsoft.com/office/drawing/2015/10/21/chartex" xmlns:cx3="http://schemas.microsoft.com/office/drawing/2016/5/9/chartex" xmlns:cx4="http://schemas.microsoft.com/office/drawing/2016/5/10/chartex" xmlns:cx5="http://schemas.microsoft.com/office/drawing/2016/5/11/chartex" xmlns:cx6="http://schemas.microsoft.com/office/drawing/2016/5/12/chartex" xmlns:cx7="http://schemas.microsoft.com/office/drawing/2016/5/13/chartex" xmlns:cx8="http://schemas.microsoft.com/office/drawing/2016/5/14/chartex" xmlns:mc="http://schemas.openxmlformats.org/markup-compatibility/2006" xmlns:aink="http://schemas.microsoft.com/office/drawing/2016/ink" xmlns:am3d="http://schemas.microsoft.com/office/drawing/2017/model3d" xmlns:o="urn:schemas-microsoft-com:office:office" xmlns:oel="http://schemas.microsoft.com/office/2019/extlst" xmlns:r="http://schemas.openxmlformats.org/officeDocument/2006/relationships" xmlns:m="http://schemas.openxmlformats.org/officeDocument/2006/math" xmlns:v="urn:schemas-microsoft-com:vml" xmlns:wp14="http://schemas.microsoft.com/office/word/2010/wordprocessingDrawing" xmlns:wp="http://schemas.openxmlformats.org/drawingml/2006/wordprocessingDrawing" xmlns:w10="urn:schemas-microsoft-com:office:word" xmlns:w="http://schemas.openxmlformats.org/wordprocessingml/2006/main" xmlns:w14="http://schemas.microsoft.com/office/word/2010/wordml" xmlns:w15="http://schemas.microsoft.com/office/word/2012/wordml" xmlns:w16cex="http://schemas.microsoft.com/office/word/2018/wordml/cex" xmlns:w16cid="http://schemas.microsoft.com/office/word/2016/wordml/cid" xmlns:w16="http://schemas.microsoft.com/office/word/2018/wordml" xmlns:w16sdtdh="http://schemas.microsoft.com/office/word/2020/wordml/sdtdatahash" xmlns:w16se="http://schemas.microsoft.com/office/word/2015/wordml/symex" xmlns:wpg="http://schemas.microsoft.com/office/word/2010/wordprocessingGroup" xmlns:wpi="http://schemas.microsoft.com/office/word/2010/wordprocessingInk" xmlns:wne="http://schemas.microsoft.com/office/word/2006/wordml" xmlns:wps="http://schemas.microsoft.com/office/word/2010/wordprocessingShape" mc:Ignorable="w14 w15 w16se w16cid w16 w16cex w16sdtdh wp14">
   <w:body>
     <w:tbl>
       <w:tblPr>
@@ -82,7 +82,28 @@
                 <w:sz w:val="20"/>
                 <w:szCs w:val="20"/>
               </w:rPr>
-              <w:t>Lernsituation, Arbeitsaufträge und vertiefende Aufgaben</w:t>
+              <w:t>Lernsituation</w:t>
+            </w:r>
+            <w:r>
+              <w:rPr>
+                <w:rStyle w:val="Funotenzeichen"/>
+                <w:rFonts w:ascii="Aptos Narrow" w:hAnsi="Aptos Narrow"/>
+                <w:b/>
+                <w:color w:val="244061" w:themeColor="accent1" w:themeShade="80"/>
+                <w:sz w:val="20"/>
+                <w:szCs w:val="20"/>
+              </w:rPr>
+              <w:footnoteReference w:id="1"/>
+            </w:r>
+            <w:r>
+              <w:rPr>
+                <w:rFonts w:ascii="Aptos Narrow" w:hAnsi="Aptos Narrow"/>
+                <w:b/>
+                <w:color w:val="244061" w:themeColor="accent1" w:themeShade="80"/>
+                <w:sz w:val="20"/>
+                <w:szCs w:val="20"/>
+              </w:rPr>
+              <w:t>, Arbeitsaufträge und vertiefende Aufgaben</w:t>
             </w:r>
           </w:p>
         </w:tc>
@@ -365,7 +386,15 @@
                 <w:sz w:val="20"/>
                 <w:szCs w:val="20"/>
               </w:rPr>
-              <w:t>Abwicklung von Kundenaufträgen nebst Kalkulation neuer Verkaufspreise</w:t>
+              <w:t>Aufträge von Kunden bearbeiten</w:t>
+            </w:r>
+            <w:r>
+              <w:rPr>
+                <w:rFonts w:ascii="Aptos Narrow" w:hAnsi="Aptos Narrow"/>
+                <w:sz w:val="20"/>
+                <w:szCs w:val="20"/>
+              </w:rPr>
+              <w:t xml:space="preserve"> und Verkaufspreise kalkulieren</w:t>
             </w:r>
           </w:p>
           <w:p>
@@ -397,7 +426,45 @@
                 <w:sz w:val="20"/>
                 <w:szCs w:val="20"/>
               </w:rPr>
-              <w:t>Alle Arbeitsaufträge zur Ausgangs- und zur erweiterten Ausgangssituation (S. 68 bzw. 77)</w:t>
+              <w:t xml:space="preserve">Alle Arbeitsaufträge zur </w:t>
+            </w:r>
+            <w:r>
+              <w:rPr>
+                <w:rFonts w:ascii="Aptos Narrow" w:hAnsi="Aptos Narrow"/>
+                <w:b/>
+                <w:bCs/>
+                <w:sz w:val="20"/>
+                <w:szCs w:val="20"/>
+              </w:rPr>
+              <w:t>Ausgangs</w:t>
+            </w:r>
+            <w:r>
+              <w:rPr>
+                <w:rFonts w:ascii="Aptos Narrow" w:hAnsi="Aptos Narrow"/>
+                <w:b/>
+                <w:bCs/>
+                <w:sz w:val="20"/>
+                <w:szCs w:val="20"/>
+              </w:rPr>
+              <w:t>situation</w:t>
+            </w:r>
+            <w:r>
+              <w:rPr>
+                <w:rFonts w:ascii="Aptos Narrow" w:hAnsi="Aptos Narrow"/>
+                <w:sz w:val="20"/>
+                <w:szCs w:val="20"/>
+              </w:rPr>
+              <w:t xml:space="preserve"> und zur </w:t>
+            </w:r>
+            <w:r>
+              <w:rPr>
+                <w:rFonts w:ascii="Aptos Narrow" w:hAnsi="Aptos Narrow"/>
+                <w:b/>
+                <w:bCs/>
+                <w:sz w:val="20"/>
+                <w:szCs w:val="20"/>
+              </w:rPr>
+              <w:t>erweiterten Ausgangssituation</w:t>
             </w:r>
           </w:p>
           <w:p>
@@ -426,10 +493,20 @@
             <w:r>
               <w:rPr>
                 <w:rFonts w:ascii="Aptos Narrow" w:hAnsi="Aptos Narrow"/>
-                <w:sz w:val="20"/>
-                <w:szCs w:val="20"/>
-              </w:rPr>
-              <w:t>Jeweils vertiefende Aufgabe 1 zur Ausgangssituation und zur erweiterten Ausgangssituation (S. 74 bzw. 83)</w:t>
+                <w:b/>
+                <w:bCs/>
+                <w:sz w:val="20"/>
+                <w:szCs w:val="20"/>
+              </w:rPr>
+              <w:t>Jeweils vertiefende Aufgabe 1</w:t>
+            </w:r>
+            <w:r>
+              <w:rPr>
+                <w:rFonts w:ascii="Aptos Narrow" w:hAnsi="Aptos Narrow"/>
+                <w:sz w:val="20"/>
+                <w:szCs w:val="20"/>
+              </w:rPr>
+              <w:t xml:space="preserve"> zur Ausgangssituation und zur erweiterten Ausgangssituation</w:t>
             </w:r>
           </w:p>
         </w:tc>
@@ -452,7 +529,6 @@
                 <w14:uncheckedState w14:val="2610" w14:font="MS Gothic"/>
               </w14:checkbox>
             </w:sdtPr>
-            <w:sdtEndPr/>
             <w:sdtContent>
               <w:p>
                 <w:pPr>
@@ -496,7 +572,6 @@
                 <w14:uncheckedState w14:val="2610" w14:font="MS Gothic"/>
               </w14:checkbox>
             </w:sdtPr>
-            <w:sdtEndPr/>
             <w:sdtContent>
               <w:p>
                 <w:pPr>
@@ -540,7 +615,6 @@
                 <w14:uncheckedState w14:val="2610" w14:font="MS Gothic"/>
               </w14:checkbox>
             </w:sdtPr>
-            <w:sdtEndPr/>
             <w:sdtContent>
               <w:p>
                 <w:pPr>
@@ -658,7 +732,7 @@
                 <w:sz w:val="20"/>
                 <w:szCs w:val="20"/>
               </w:rPr>
-              <w:t>Kaufvertrag, Allgemeine Geschäftsbedingungen (AGB) oder auch Lieferungs- und Zahlungsbedingungen</w:t>
+              <w:t>Fehlerhafte Angebotsschreiben überarbeiten</w:t>
             </w:r>
           </w:p>
           <w:p>
@@ -733,7 +807,6 @@
                 <w14:uncheckedState w14:val="2610" w14:font="MS Gothic"/>
               </w14:checkbox>
             </w:sdtPr>
-            <w:sdtEndPr/>
             <w:sdtContent>
               <w:p>
                 <w:pPr>
@@ -777,7 +850,6 @@
                 <w14:uncheckedState w14:val="2610" w14:font="MS Gothic"/>
               </w14:checkbox>
             </w:sdtPr>
-            <w:sdtEndPr/>
             <w:sdtContent>
               <w:p>
                 <w:pPr>
@@ -821,7 +893,6 @@
                 <w14:uncheckedState w14:val="2610" w14:font="MS Gothic"/>
               </w14:checkbox>
             </w:sdtPr>
-            <w:sdtEndPr/>
             <w:sdtContent>
               <w:p>
                 <w:pPr>
@@ -932,6 +1003,14 @@
               </w:rPr>
               <w:t>Sonderangebote</w:t>
             </w:r>
+            <w:r>
+              <w:rPr>
+                <w:rFonts w:ascii="Aptos Narrow" w:hAnsi="Aptos Narrow"/>
+                <w:sz w:val="20"/>
+                <w:szCs w:val="20"/>
+              </w:rPr>
+              <w:t xml:space="preserve"> an Kunden formulieren</w:t>
+            </w:r>
           </w:p>
           <w:p>
             <w:pPr>
@@ -1005,7 +1084,6 @@
                 <w14:uncheckedState w14:val="2610" w14:font="MS Gothic"/>
               </w14:checkbox>
             </w:sdtPr>
-            <w:sdtEndPr/>
             <w:sdtContent>
               <w:p>
                 <w:pPr>
@@ -1049,7 +1127,6 @@
                 <w14:uncheckedState w14:val="2610" w14:font="MS Gothic"/>
               </w14:checkbox>
             </w:sdtPr>
-            <w:sdtEndPr/>
             <w:sdtContent>
               <w:p>
                 <w:pPr>
@@ -1093,7 +1170,6 @@
                 <w14:uncheckedState w14:val="2610" w14:font="MS Gothic"/>
               </w14:checkbox>
             </w:sdtPr>
-            <w:sdtEndPr/>
             <w:sdtContent>
               <w:p>
                 <w:pPr>
@@ -1202,7 +1278,7 @@
                 <w:sz w:val="20"/>
                 <w:szCs w:val="20"/>
               </w:rPr>
-              <w:t>Organisation und Überwachung von Aufträgen</w:t>
+              <w:t>Die Auftragsabwicklung organisieren und überwachen</w:t>
             </w:r>
           </w:p>
           <w:p>
@@ -1234,7 +1310,23 @@
                 <w:sz w:val="20"/>
                 <w:szCs w:val="20"/>
               </w:rPr>
-              <w:t>alle Arbeitsaufträge zu den Situationen</w:t>
+              <w:t>alle Arbeitsaufträge zu</w:t>
+            </w:r>
+            <w:r>
+              <w:rPr>
+                <w:rFonts w:ascii="Aptos Narrow" w:hAnsi="Aptos Narrow"/>
+                <w:sz w:val="20"/>
+                <w:szCs w:val="20"/>
+              </w:rPr>
+              <w:t>r Ausgangsituation und zur erweiterten</w:t>
+            </w:r>
+            <w:r>
+              <w:rPr>
+                <w:rFonts w:ascii="Aptos Narrow" w:hAnsi="Aptos Narrow"/>
+                <w:sz w:val="20"/>
+                <w:szCs w:val="20"/>
+              </w:rPr>
+              <w:t xml:space="preserve"> Ausgangssituation</w:t>
             </w:r>
           </w:p>
           <w:p>
@@ -1277,7 +1369,6 @@
                 <w14:uncheckedState w14:val="2610" w14:font="MS Gothic"/>
               </w14:checkbox>
             </w:sdtPr>
-            <w:sdtEndPr/>
             <w:sdtContent>
               <w:p>
                 <w:pPr>
@@ -1321,7 +1412,6 @@
                 <w14:uncheckedState w14:val="2610" w14:font="MS Gothic"/>
               </w14:checkbox>
             </w:sdtPr>
-            <w:sdtEndPr/>
             <w:sdtContent>
               <w:p>
                 <w:pPr>
@@ -1365,7 +1455,6 @@
                 <w14:uncheckedState w14:val="2610" w14:font="MS Gothic"/>
               </w14:checkbox>
             </w:sdtPr>
-            <w:sdtEndPr/>
             <w:sdtContent>
               <w:p>
                 <w:pPr>
@@ -1408,13 +1497,6 @@
         </w:tc>
       </w:tr>
     </w:tbl>
-    <w:p>
-      <w:pPr>
-        <w:rPr>
-          <w:rFonts w:ascii="Aptos Narrow" w:hAnsi="Aptos Narrow"/>
-        </w:rPr>
-      </w:pPr>
-    </w:p>
     <w:p>
       <w:pPr>
         <w:rPr>
@@ -1803,7 +1885,31 @@
                 <w:sz w:val="20"/>
                 <w:szCs w:val="20"/>
               </w:rPr>
-              <w:t>Informations- und Beratungsgespräche mit Geschäftspartnern</w:t>
+              <w:t xml:space="preserve">Informations- und Beratungsgespräche mit </w:t>
+            </w:r>
+            <w:r>
+              <w:rPr>
+                <w:rFonts w:ascii="Aptos Narrow" w:hAnsi="Aptos Narrow"/>
+                <w:sz w:val="20"/>
+                <w:szCs w:val="20"/>
+              </w:rPr>
+              <w:t xml:space="preserve">Geschäftspartnerinnen und </w:t>
+            </w:r>
+            <w:r>
+              <w:rPr>
+                <w:rFonts w:ascii="Aptos Narrow" w:hAnsi="Aptos Narrow"/>
+                <w:sz w:val="20"/>
+                <w:szCs w:val="20"/>
+              </w:rPr>
+              <w:t>Geschäftspartnern</w:t>
+            </w:r>
+            <w:r>
+              <w:rPr>
+                <w:rFonts w:ascii="Aptos Narrow" w:hAnsi="Aptos Narrow"/>
+                <w:sz w:val="20"/>
+                <w:szCs w:val="20"/>
+              </w:rPr>
+              <w:t xml:space="preserve"> führen</w:t>
             </w:r>
           </w:p>
           <w:p>
@@ -1910,7 +2016,6 @@
                 <w14:uncheckedState w14:val="2610" w14:font="MS Gothic"/>
               </w14:checkbox>
             </w:sdtPr>
-            <w:sdtEndPr/>
             <w:sdtContent>
               <w:p>
                 <w:pPr>
@@ -1955,7 +2060,6 @@
                 <w14:uncheckedState w14:val="2610" w14:font="MS Gothic"/>
               </w14:checkbox>
             </w:sdtPr>
-            <w:sdtEndPr/>
             <w:sdtContent>
               <w:p>
                 <w:pPr>
@@ -2000,7 +2104,6 @@
                 <w14:uncheckedState w14:val="2610" w14:font="MS Gothic"/>
               </w14:checkbox>
             </w:sdtPr>
-            <w:sdtEndPr/>
             <w:sdtContent>
               <w:p>
                 <w:pPr>
@@ -2118,7 +2221,39 @@
                 <w:sz w:val="20"/>
                 <w:szCs w:val="20"/>
               </w:rPr>
-              <w:t>Auf Einwände und Vorwände von Kunden reagieren</w:t>
+              <w:t xml:space="preserve">Auf Einwände und Vorwände von </w:t>
+            </w:r>
+            <w:r>
+              <w:rPr>
+                <w:rFonts w:ascii="Aptos Narrow" w:hAnsi="Aptos Narrow"/>
+                <w:sz w:val="20"/>
+                <w:szCs w:val="20"/>
+              </w:rPr>
+              <w:t xml:space="preserve">Kundinnen und </w:t>
+            </w:r>
+            <w:r>
+              <w:rPr>
+                <w:rFonts w:ascii="Aptos Narrow" w:hAnsi="Aptos Narrow"/>
+                <w:sz w:val="20"/>
+                <w:szCs w:val="20"/>
+              </w:rPr>
+              <w:t xml:space="preserve">Kunden </w:t>
+            </w:r>
+            <w:r>
+              <w:rPr>
+                <w:rFonts w:ascii="Aptos Narrow" w:hAnsi="Aptos Narrow"/>
+                <w:sz w:val="20"/>
+                <w:szCs w:val="20"/>
+              </w:rPr>
+              <w:t xml:space="preserve">richtig </w:t>
+            </w:r>
+            <w:r>
+              <w:rPr>
+                <w:rFonts w:ascii="Aptos Narrow" w:hAnsi="Aptos Narrow"/>
+                <w:sz w:val="20"/>
+                <w:szCs w:val="20"/>
+              </w:rPr>
+              <w:t>reagieren</w:t>
             </w:r>
           </w:p>
           <w:p>
@@ -2170,7 +2305,7 @@
                 <w:sz w:val="20"/>
                 <w:szCs w:val="20"/>
               </w:rPr>
-              <w:t>vertiefende. Aufgaben 2 und 4</w:t>
+              <w:t>vertiefende Aufgaben 2 und 4</w:t>
             </w:r>
           </w:p>
         </w:tc>
@@ -2193,7 +2328,6 @@
                 <w14:uncheckedState w14:val="2610" w14:font="MS Gothic"/>
               </w14:checkbox>
             </w:sdtPr>
-            <w:sdtEndPr/>
             <w:sdtContent>
               <w:p>
                 <w:pPr>
@@ -2237,7 +2371,6 @@
                 <w14:uncheckedState w14:val="2610" w14:font="MS Gothic"/>
               </w14:checkbox>
             </w:sdtPr>
-            <w:sdtEndPr/>
             <w:sdtContent>
               <w:p>
                 <w:pPr>
@@ -2281,7 +2414,6 @@
                 <w14:uncheckedState w14:val="2610" w14:font="MS Gothic"/>
               </w14:checkbox>
             </w:sdtPr>
-            <w:sdtEndPr/>
             <w:sdtContent>
               <w:p>
                 <w:pPr>
@@ -2408,7 +2540,23 @@
                 <w:sz w:val="20"/>
                 <w:szCs w:val="20"/>
               </w:rPr>
-              <w:t>Mit Beschwerden bzw. Reklamationen von Kunden umgehen</w:t>
+              <w:t xml:space="preserve">Mit Beschwerden bzw. Reklamationen </w:t>
+            </w:r>
+            <w:r>
+              <w:rPr>
+                <w:rFonts w:ascii="Aptos Narrow" w:hAnsi="Aptos Narrow"/>
+                <w:sz w:val="20"/>
+                <w:szCs w:val="20"/>
+              </w:rPr>
+              <w:t>richtig</w:t>
+            </w:r>
+            <w:r>
+              <w:rPr>
+                <w:rFonts w:ascii="Aptos Narrow" w:hAnsi="Aptos Narrow"/>
+                <w:sz w:val="20"/>
+                <w:szCs w:val="20"/>
+              </w:rPr>
+              <w:t xml:space="preserve"> umgehen</w:t>
             </w:r>
           </w:p>
           <w:p>
@@ -2483,7 +2631,6 @@
                 <w14:uncheckedState w14:val="2610" w14:font="MS Gothic"/>
               </w14:checkbox>
             </w:sdtPr>
-            <w:sdtEndPr/>
             <w:sdtContent>
               <w:p>
                 <w:pPr>
@@ -2527,7 +2674,6 @@
                 <w14:uncheckedState w14:val="2610" w14:font="MS Gothic"/>
               </w14:checkbox>
             </w:sdtPr>
-            <w:sdtEndPr/>
             <w:sdtContent>
               <w:p>
                 <w:pPr>
@@ -2571,7 +2717,6 @@
                 <w14:uncheckedState w14:val="2610" w14:font="MS Gothic"/>
               </w14:checkbox>
             </w:sdtPr>
-            <w:sdtEndPr/>
             <w:sdtContent>
               <w:p>
                 <w:pPr>
@@ -2634,7 +2779,7 @@
 </file>
 
 <file path=word/endnotes.xml><?xml version="1.0" encoding="utf-8"?>
-<w:endnotes xmlns:wpc="http://schemas.microsoft.com/office/word/2010/wordprocessingCanvas" xmlns:cx="http://schemas.microsoft.com/office/drawing/2014/chartex" xmlns:cx1="http://schemas.microsoft.com/office/drawing/2015/9/8/chartex" xmlns:cx2="http://schemas.microsoft.com/office/drawing/2015/10/21/chartex" xmlns:cx3="http://schemas.microsoft.com/office/drawing/2016/5/9/chartex" xmlns:cx4="http://schemas.microsoft.com/office/drawing/2016/5/10/chartex" xmlns:cx5="http://schemas.microsoft.com/office/drawing/2016/5/11/chartex" xmlns:cx6="http://schemas.microsoft.com/office/drawing/2016/5/12/chartex" xmlns:cx7="http://schemas.microsoft.com/office/drawing/2016/5/13/chartex" xmlns:cx8="http://schemas.microsoft.com/office/drawing/2016/5/14/chartex" xmlns:mc="http://schemas.openxmlformats.org/markup-compatibility/2006" xmlns:aink="http://schemas.microsoft.com/office/drawing/2016/ink" xmlns:am3d="http://schemas.microsoft.com/office/drawing/2017/model3d" xmlns:o="urn:schemas-microsoft-com:office:office" xmlns:oel="http://schemas.microsoft.com/office/2019/extlst" xmlns:r="http://schemas.openxmlformats.org/officeDocument/2006/relationships" xmlns:m="http://schemas.openxmlformats.org/officeDocument/2006/math" xmlns:v="urn:schemas-microsoft-com:vml" xmlns:wp14="http://schemas.microsoft.com/office/word/2010/wordprocessingDrawing" xmlns:wp="http://schemas.openxmlformats.org/drawingml/2006/wordprocessingDrawing" xmlns:w10="urn:schemas-microsoft-com:office:word" xmlns:w="http://schemas.openxmlformats.org/wordprocessingml/2006/main" xmlns:w14="http://schemas.microsoft.com/office/word/2010/wordml" xmlns:w15="http://schemas.microsoft.com/office/word/2012/wordml" xmlns:w16cex="http://schemas.microsoft.com/office/word/2018/wordml/cex" xmlns:w16cid="http://schemas.microsoft.com/office/word/2016/wordml/cid" xmlns:w16="http://schemas.microsoft.com/office/word/2018/wordml" xmlns:w16du="http://schemas.microsoft.com/office/word/2023/wordml/word16du" xmlns:w16sdtdh="http://schemas.microsoft.com/office/word/2020/wordml/sdtdatahash" xmlns:w16sdtfl="http://schemas.microsoft.com/office/word/2024/wordml/sdtformatlock" xmlns:w16se="http://schemas.microsoft.com/office/word/2015/wordml/symex" xmlns:wpg="http://schemas.microsoft.com/office/word/2010/wordprocessingGroup" xmlns:wpi="http://schemas.microsoft.com/office/word/2010/wordprocessingInk" xmlns:wne="http://schemas.microsoft.com/office/word/2006/wordml" xmlns:wps="http://schemas.microsoft.com/office/word/2010/wordprocessingShape" mc:Ignorable="w14 w15 w16se w16cid w16 w16cex w16sdtdh w16sdtfl w16du wp14">
+<w:endnotes xmlns:wpc="http://schemas.microsoft.com/office/word/2010/wordprocessingCanvas" xmlns:cx="http://schemas.microsoft.com/office/drawing/2014/chartex" xmlns:cx1="http://schemas.microsoft.com/office/drawing/2015/9/8/chartex" xmlns:cx2="http://schemas.microsoft.com/office/drawing/2015/10/21/chartex" xmlns:cx3="http://schemas.microsoft.com/office/drawing/2016/5/9/chartex" xmlns:cx4="http://schemas.microsoft.com/office/drawing/2016/5/10/chartex" xmlns:cx5="http://schemas.microsoft.com/office/drawing/2016/5/11/chartex" xmlns:cx6="http://schemas.microsoft.com/office/drawing/2016/5/12/chartex" xmlns:cx7="http://schemas.microsoft.com/office/drawing/2016/5/13/chartex" xmlns:cx8="http://schemas.microsoft.com/office/drawing/2016/5/14/chartex" xmlns:mc="http://schemas.openxmlformats.org/markup-compatibility/2006" xmlns:aink="http://schemas.microsoft.com/office/drawing/2016/ink" xmlns:am3d="http://schemas.microsoft.com/office/drawing/2017/model3d" xmlns:o="urn:schemas-microsoft-com:office:office" xmlns:oel="http://schemas.microsoft.com/office/2019/extlst" xmlns:r="http://schemas.openxmlformats.org/officeDocument/2006/relationships" xmlns:m="http://schemas.openxmlformats.org/officeDocument/2006/math" xmlns:v="urn:schemas-microsoft-com:vml" xmlns:wp14="http://schemas.microsoft.com/office/word/2010/wordprocessingDrawing" xmlns:wp="http://schemas.openxmlformats.org/drawingml/2006/wordprocessingDrawing" xmlns:w10="urn:schemas-microsoft-com:office:word" xmlns:w="http://schemas.openxmlformats.org/wordprocessingml/2006/main" xmlns:w14="http://schemas.microsoft.com/office/word/2010/wordml" xmlns:w15="http://schemas.microsoft.com/office/word/2012/wordml" xmlns:w16cex="http://schemas.microsoft.com/office/word/2018/wordml/cex" xmlns:w16cid="http://schemas.microsoft.com/office/word/2016/wordml/cid" xmlns:w16="http://schemas.microsoft.com/office/word/2018/wordml" xmlns:w16sdtdh="http://schemas.microsoft.com/office/word/2020/wordml/sdtdatahash" xmlns:w16se="http://schemas.microsoft.com/office/word/2015/wordml/symex" xmlns:wpg="http://schemas.microsoft.com/office/word/2010/wordprocessingGroup" xmlns:wpi="http://schemas.microsoft.com/office/word/2010/wordprocessingInk" xmlns:wne="http://schemas.microsoft.com/office/word/2006/wordml" xmlns:wps="http://schemas.microsoft.com/office/word/2010/wordprocessingShape" mc:Ignorable="w14 w15 w16se w16cid w16 w16cex w16sdtdh wp14">
   <w:endnote w:type="separator" w:id="-1">
     <w:p>
       <w:pPr>
@@ -2659,7 +2804,7 @@
 </file>
 
 <file path=word/footer1.xml><?xml version="1.0" encoding="utf-8"?>
-<w:ftr xmlns:wpc="http://schemas.microsoft.com/office/word/2010/wordprocessingCanvas" xmlns:cx="http://schemas.microsoft.com/office/drawing/2014/chartex" xmlns:cx1="http://schemas.microsoft.com/office/drawing/2015/9/8/chartex" xmlns:cx2="http://schemas.microsoft.com/office/drawing/2015/10/21/chartex" xmlns:cx3="http://schemas.microsoft.com/office/drawing/2016/5/9/chartex" xmlns:cx4="http://schemas.microsoft.com/office/drawing/2016/5/10/chartex" xmlns:cx5="http://schemas.microsoft.com/office/drawing/2016/5/11/chartex" xmlns:cx6="http://schemas.microsoft.com/office/drawing/2016/5/12/chartex" xmlns:cx7="http://schemas.microsoft.com/office/drawing/2016/5/13/chartex" xmlns:cx8="http://schemas.microsoft.com/office/drawing/2016/5/14/chartex" xmlns:mc="http://schemas.openxmlformats.org/markup-compatibility/2006" xmlns:aink="http://schemas.microsoft.com/office/drawing/2016/ink" xmlns:am3d="http://schemas.microsoft.com/office/drawing/2017/model3d" xmlns:o="urn:schemas-microsoft-com:office:office" xmlns:oel="http://schemas.microsoft.com/office/2019/extlst" xmlns:r="http://schemas.openxmlformats.org/officeDocument/2006/relationships" xmlns:m="http://schemas.openxmlformats.org/officeDocument/2006/math" xmlns:v="urn:schemas-microsoft-com:vml" xmlns:wp14="http://schemas.microsoft.com/office/word/2010/wordprocessingDrawing" xmlns:wp="http://schemas.openxmlformats.org/drawingml/2006/wordprocessingDrawing" xmlns:w10="urn:schemas-microsoft-com:office:word" xmlns:w="http://schemas.openxmlformats.org/wordprocessingml/2006/main" xmlns:w14="http://schemas.microsoft.com/office/word/2010/wordml" xmlns:w15="http://schemas.microsoft.com/office/word/2012/wordml" xmlns:w16cex="http://schemas.microsoft.com/office/word/2018/wordml/cex" xmlns:w16cid="http://schemas.microsoft.com/office/word/2016/wordml/cid" xmlns:w16="http://schemas.microsoft.com/office/word/2018/wordml" xmlns:w16du="http://schemas.microsoft.com/office/word/2023/wordml/word16du" xmlns:w16sdtdh="http://schemas.microsoft.com/office/word/2020/wordml/sdtdatahash" xmlns:w16sdtfl="http://schemas.microsoft.com/office/word/2024/wordml/sdtformatlock" xmlns:w16se="http://schemas.microsoft.com/office/word/2015/wordml/symex" xmlns:wpg="http://schemas.microsoft.com/office/word/2010/wordprocessingGroup" xmlns:wpi="http://schemas.microsoft.com/office/word/2010/wordprocessingInk" xmlns:wne="http://schemas.microsoft.com/office/word/2006/wordml" xmlns:wps="http://schemas.microsoft.com/office/word/2010/wordprocessingShape" mc:Ignorable="w14 w15 w16se w16cid w16 w16cex w16sdtdh w16sdtfl w16du wp14">
+<w:ftr xmlns:wpc="http://schemas.microsoft.com/office/word/2010/wordprocessingCanvas" xmlns:cx="http://schemas.microsoft.com/office/drawing/2014/chartex" xmlns:cx1="http://schemas.microsoft.com/office/drawing/2015/9/8/chartex" xmlns:cx2="http://schemas.microsoft.com/office/drawing/2015/10/21/chartex" xmlns:cx3="http://schemas.microsoft.com/office/drawing/2016/5/9/chartex" xmlns:cx4="http://schemas.microsoft.com/office/drawing/2016/5/10/chartex" xmlns:cx5="http://schemas.microsoft.com/office/drawing/2016/5/11/chartex" xmlns:cx6="http://schemas.microsoft.com/office/drawing/2016/5/12/chartex" xmlns:cx7="http://schemas.microsoft.com/office/drawing/2016/5/13/chartex" xmlns:cx8="http://schemas.microsoft.com/office/drawing/2016/5/14/chartex" xmlns:mc="http://schemas.openxmlformats.org/markup-compatibility/2006" xmlns:aink="http://schemas.microsoft.com/office/drawing/2016/ink" xmlns:am3d="http://schemas.microsoft.com/office/drawing/2017/model3d" xmlns:o="urn:schemas-microsoft-com:office:office" xmlns:oel="http://schemas.microsoft.com/office/2019/extlst" xmlns:r="http://schemas.openxmlformats.org/officeDocument/2006/relationships" xmlns:m="http://schemas.openxmlformats.org/officeDocument/2006/math" xmlns:v="urn:schemas-microsoft-com:vml" xmlns:wp14="http://schemas.microsoft.com/office/word/2010/wordprocessingDrawing" xmlns:wp="http://schemas.openxmlformats.org/drawingml/2006/wordprocessingDrawing" xmlns:w10="urn:schemas-microsoft-com:office:word" xmlns:w="http://schemas.openxmlformats.org/wordprocessingml/2006/main" xmlns:w14="http://schemas.microsoft.com/office/word/2010/wordml" xmlns:w15="http://schemas.microsoft.com/office/word/2012/wordml" xmlns:w16cex="http://schemas.microsoft.com/office/word/2018/wordml/cex" xmlns:w16cid="http://schemas.microsoft.com/office/word/2016/wordml/cid" xmlns:w16="http://schemas.microsoft.com/office/word/2018/wordml" xmlns:w16sdtdh="http://schemas.microsoft.com/office/word/2020/wordml/sdtdatahash" xmlns:w16se="http://schemas.microsoft.com/office/word/2015/wordml/symex" xmlns:wpg="http://schemas.microsoft.com/office/word/2010/wordprocessingGroup" xmlns:wpi="http://schemas.microsoft.com/office/word/2010/wordprocessingInk" xmlns:wne="http://schemas.microsoft.com/office/word/2006/wordml" xmlns:wps="http://schemas.microsoft.com/office/word/2010/wordprocessingShape" mc:Ignorable="w14 w15 w16se w16cid w16 w16cex w16sdtdh wp14">
   <w:p>
     <w:pPr>
       <w:rPr>
@@ -2951,7 +3096,7 @@
 </file>
 
 <file path=word/footnotes.xml><?xml version="1.0" encoding="utf-8"?>
-<w:footnotes xmlns:wpc="http://schemas.microsoft.com/office/word/2010/wordprocessingCanvas" xmlns:cx="http://schemas.microsoft.com/office/drawing/2014/chartex" xmlns:cx1="http://schemas.microsoft.com/office/drawing/2015/9/8/chartex" xmlns:cx2="http://schemas.microsoft.com/office/drawing/2015/10/21/chartex" xmlns:cx3="http://schemas.microsoft.com/office/drawing/2016/5/9/chartex" xmlns:cx4="http://schemas.microsoft.com/office/drawing/2016/5/10/chartex" xmlns:cx5="http://schemas.microsoft.com/office/drawing/2016/5/11/chartex" xmlns:cx6="http://schemas.microsoft.com/office/drawing/2016/5/12/chartex" xmlns:cx7="http://schemas.microsoft.com/office/drawing/2016/5/13/chartex" xmlns:cx8="http://schemas.microsoft.com/office/drawing/2016/5/14/chartex" xmlns:mc="http://schemas.openxmlformats.org/markup-compatibility/2006" xmlns:aink="http://schemas.microsoft.com/office/drawing/2016/ink" xmlns:am3d="http://schemas.microsoft.com/office/drawing/2017/model3d" xmlns:o="urn:schemas-microsoft-com:office:office" xmlns:oel="http://schemas.microsoft.com/office/2019/extlst" xmlns:r="http://schemas.openxmlformats.org/officeDocument/2006/relationships" xmlns:m="http://schemas.openxmlformats.org/officeDocument/2006/math" xmlns:v="urn:schemas-microsoft-com:vml" xmlns:wp14="http://schemas.microsoft.com/office/word/2010/wordprocessingDrawing" xmlns:wp="http://schemas.openxmlformats.org/drawingml/2006/wordprocessingDrawing" xmlns:w10="urn:schemas-microsoft-com:office:word" xmlns:w="http://schemas.openxmlformats.org/wordprocessingml/2006/main" xmlns:w14="http://schemas.microsoft.com/office/word/2010/wordml" xmlns:w15="http://schemas.microsoft.com/office/word/2012/wordml" xmlns:w16cex="http://schemas.microsoft.com/office/word/2018/wordml/cex" xmlns:w16cid="http://schemas.microsoft.com/office/word/2016/wordml/cid" xmlns:w16="http://schemas.microsoft.com/office/word/2018/wordml" xmlns:w16du="http://schemas.microsoft.com/office/word/2023/wordml/word16du" xmlns:w16sdtdh="http://schemas.microsoft.com/office/word/2020/wordml/sdtdatahash" xmlns:w16sdtfl="http://schemas.microsoft.com/office/word/2024/wordml/sdtformatlock" xmlns:w16se="http://schemas.microsoft.com/office/word/2015/wordml/symex" xmlns:wpg="http://schemas.microsoft.com/office/word/2010/wordprocessingGroup" xmlns:wpi="http://schemas.microsoft.com/office/word/2010/wordprocessingInk" xmlns:wne="http://schemas.microsoft.com/office/word/2006/wordml" xmlns:wps="http://schemas.microsoft.com/office/word/2010/wordprocessingShape" mc:Ignorable="w14 w15 w16se w16cid w16 w16cex w16sdtdh w16sdtfl w16du wp14">
+<w:footnotes xmlns:wpc="http://schemas.microsoft.com/office/word/2010/wordprocessingCanvas" xmlns:cx="http://schemas.microsoft.com/office/drawing/2014/chartex" xmlns:cx1="http://schemas.microsoft.com/office/drawing/2015/9/8/chartex" xmlns:cx2="http://schemas.microsoft.com/office/drawing/2015/10/21/chartex" xmlns:cx3="http://schemas.microsoft.com/office/drawing/2016/5/9/chartex" xmlns:cx4="http://schemas.microsoft.com/office/drawing/2016/5/10/chartex" xmlns:cx5="http://schemas.microsoft.com/office/drawing/2016/5/11/chartex" xmlns:cx6="http://schemas.microsoft.com/office/drawing/2016/5/12/chartex" xmlns:cx7="http://schemas.microsoft.com/office/drawing/2016/5/13/chartex" xmlns:cx8="http://schemas.microsoft.com/office/drawing/2016/5/14/chartex" xmlns:mc="http://schemas.openxmlformats.org/markup-compatibility/2006" xmlns:aink="http://schemas.microsoft.com/office/drawing/2016/ink" xmlns:am3d="http://schemas.microsoft.com/office/drawing/2017/model3d" xmlns:o="urn:schemas-microsoft-com:office:office" xmlns:oel="http://schemas.microsoft.com/office/2019/extlst" xmlns:r="http://schemas.openxmlformats.org/officeDocument/2006/relationships" xmlns:m="http://schemas.openxmlformats.org/officeDocument/2006/math" xmlns:v="urn:schemas-microsoft-com:vml" xmlns:wp14="http://schemas.microsoft.com/office/word/2010/wordprocessingDrawing" xmlns:wp="http://schemas.openxmlformats.org/drawingml/2006/wordprocessingDrawing" xmlns:w10="urn:schemas-microsoft-com:office:word" xmlns:w="http://schemas.openxmlformats.org/wordprocessingml/2006/main" xmlns:w14="http://schemas.microsoft.com/office/word/2010/wordml" xmlns:w15="http://schemas.microsoft.com/office/word/2012/wordml" xmlns:w16cex="http://schemas.microsoft.com/office/word/2018/wordml/cex" xmlns:w16cid="http://schemas.microsoft.com/office/word/2016/wordml/cid" xmlns:w16="http://schemas.microsoft.com/office/word/2018/wordml" xmlns:w16sdtdh="http://schemas.microsoft.com/office/word/2020/wordml/sdtdatahash" xmlns:w16se="http://schemas.microsoft.com/office/word/2015/wordml/symex" xmlns:wpg="http://schemas.microsoft.com/office/word/2010/wordprocessingGroup" xmlns:wpi="http://schemas.microsoft.com/office/word/2010/wordprocessingInk" xmlns:wne="http://schemas.microsoft.com/office/word/2006/wordml" xmlns:wps="http://schemas.microsoft.com/office/word/2010/wordprocessingShape" mc:Ignorable="w14 w15 w16se w16cid w16 w16cex w16sdtdh wp14">
   <w:footnote w:type="separator" w:id="-1">
     <w:p>
       <w:pPr>
@@ -2972,11 +3117,33 @@
       </w:r>
     </w:p>
   </w:footnote>
+  <w:footnote w:id="1">
+    <w:p>
+      <w:pPr>
+        <w:pStyle w:val="Funotentext"/>
+      </w:pPr>
+      <w:r>
+        <w:rPr>
+          <w:rStyle w:val="Funotenzeichen"/>
+        </w:rPr>
+        <w:footnoteRef/>
+      </w:r>
+      <w:r>
+        <w:t xml:space="preserve"> Bitte erstellen Sie pro Lernsituation </w:t>
+      </w:r>
+      <w:r>
+        <w:t>eine Arbeitsdatei; Dateibezeichnung z. B. LS 3.2</w:t>
+      </w:r>
+      <w:r>
+        <w:t xml:space="preserve"> Auftragsbearbeitung-Müller.docx</w:t>
+      </w:r>
+    </w:p>
+  </w:footnote>
 </w:footnotes>
 </file>
 
 <file path=word/header1.xml><?xml version="1.0" encoding="utf-8"?>
-<w:hdr xmlns:wpc="http://schemas.microsoft.com/office/word/2010/wordprocessingCanvas" xmlns:cx="http://schemas.microsoft.com/office/drawing/2014/chartex" xmlns:cx1="http://schemas.microsoft.com/office/drawing/2015/9/8/chartex" xmlns:cx2="http://schemas.microsoft.com/office/drawing/2015/10/21/chartex" xmlns:cx3="http://schemas.microsoft.com/office/drawing/2016/5/9/chartex" xmlns:cx4="http://schemas.microsoft.com/office/drawing/2016/5/10/chartex" xmlns:cx5="http://schemas.microsoft.com/office/drawing/2016/5/11/chartex" xmlns:cx6="http://schemas.microsoft.com/office/drawing/2016/5/12/chartex" xmlns:cx7="http://schemas.microsoft.com/office/drawing/2016/5/13/chartex" xmlns:cx8="http://schemas.microsoft.com/office/drawing/2016/5/14/chartex" xmlns:mc="http://schemas.openxmlformats.org/markup-compatibility/2006" xmlns:aink="http://schemas.microsoft.com/office/drawing/2016/ink" xmlns:am3d="http://schemas.microsoft.com/office/drawing/2017/model3d" xmlns:o="urn:schemas-microsoft-com:office:office" xmlns:oel="http://schemas.microsoft.com/office/2019/extlst" xmlns:r="http://schemas.openxmlformats.org/officeDocument/2006/relationships" xmlns:m="http://schemas.openxmlformats.org/officeDocument/2006/math" xmlns:v="urn:schemas-microsoft-com:vml" xmlns:wp14="http://schemas.microsoft.com/office/word/2010/wordprocessingDrawing" xmlns:wp="http://schemas.openxmlformats.org/drawingml/2006/wordprocessingDrawing" xmlns:w10="urn:schemas-microsoft-com:office:word" xmlns:w="http://schemas.openxmlformats.org/wordprocessingml/2006/main" xmlns:w14="http://schemas.microsoft.com/office/word/2010/wordml" xmlns:w15="http://schemas.microsoft.com/office/word/2012/wordml" xmlns:w16cex="http://schemas.microsoft.com/office/word/2018/wordml/cex" xmlns:w16cid="http://schemas.microsoft.com/office/word/2016/wordml/cid" xmlns:w16="http://schemas.microsoft.com/office/word/2018/wordml" xmlns:w16du="http://schemas.microsoft.com/office/word/2023/wordml/word16du" xmlns:w16sdtdh="http://schemas.microsoft.com/office/word/2020/wordml/sdtdatahash" xmlns:w16sdtfl="http://schemas.microsoft.com/office/word/2024/wordml/sdtformatlock" xmlns:w16se="http://schemas.microsoft.com/office/word/2015/wordml/symex" xmlns:wpg="http://schemas.microsoft.com/office/word/2010/wordprocessingGroup" xmlns:wpi="http://schemas.microsoft.com/office/word/2010/wordprocessingInk" xmlns:wne="http://schemas.microsoft.com/office/word/2006/wordml" xmlns:wps="http://schemas.microsoft.com/office/word/2010/wordprocessingShape" mc:Ignorable="w14 w15 w16se w16cid w16 w16cex w16sdtdh w16sdtfl w16du wp14">
+<w:hdr xmlns:wpc="http://schemas.microsoft.com/office/word/2010/wordprocessingCanvas" xmlns:cx="http://schemas.microsoft.com/office/drawing/2014/chartex" xmlns:cx1="http://schemas.microsoft.com/office/drawing/2015/9/8/chartex" xmlns:cx2="http://schemas.microsoft.com/office/drawing/2015/10/21/chartex" xmlns:cx3="http://schemas.microsoft.com/office/drawing/2016/5/9/chartex" xmlns:cx4="http://schemas.microsoft.com/office/drawing/2016/5/10/chartex" xmlns:cx5="http://schemas.microsoft.com/office/drawing/2016/5/11/chartex" xmlns:cx6="http://schemas.microsoft.com/office/drawing/2016/5/12/chartex" xmlns:cx7="http://schemas.microsoft.com/office/drawing/2016/5/13/chartex" xmlns:cx8="http://schemas.microsoft.com/office/drawing/2016/5/14/chartex" xmlns:mc="http://schemas.openxmlformats.org/markup-compatibility/2006" xmlns:aink="http://schemas.microsoft.com/office/drawing/2016/ink" xmlns:am3d="http://schemas.microsoft.com/office/drawing/2017/model3d" xmlns:o="urn:schemas-microsoft-com:office:office" xmlns:oel="http://schemas.microsoft.com/office/2019/extlst" xmlns:r="http://schemas.openxmlformats.org/officeDocument/2006/relationships" xmlns:m="http://schemas.openxmlformats.org/officeDocument/2006/math" xmlns:v="urn:schemas-microsoft-com:vml" xmlns:wp14="http://schemas.microsoft.com/office/word/2010/wordprocessingDrawing" xmlns:wp="http://schemas.openxmlformats.org/drawingml/2006/wordprocessingDrawing" xmlns:w10="urn:schemas-microsoft-com:office:word" xmlns:w="http://schemas.openxmlformats.org/wordprocessingml/2006/main" xmlns:w14="http://schemas.microsoft.com/office/word/2010/wordml" xmlns:w15="http://schemas.microsoft.com/office/word/2012/wordml" xmlns:w16cex="http://schemas.microsoft.com/office/word/2018/wordml/cex" xmlns:w16cid="http://schemas.microsoft.com/office/word/2016/wordml/cid" xmlns:w16="http://schemas.microsoft.com/office/word/2018/wordml" xmlns:w16sdtdh="http://schemas.microsoft.com/office/word/2020/wordml/sdtdatahash" xmlns:w16se="http://schemas.microsoft.com/office/word/2015/wordml/symex" xmlns:wpg="http://schemas.microsoft.com/office/word/2010/wordprocessingGroup" xmlns:wpi="http://schemas.microsoft.com/office/word/2010/wordprocessingInk" xmlns:wne="http://schemas.microsoft.com/office/word/2006/wordml" xmlns:wps="http://schemas.microsoft.com/office/word/2010/wordprocessingShape" mc:Ignorable="w14 w15 w16se w16cid w16 w16cex w16sdtdh wp14">
   <w:tbl>
     <w:tblPr>
       <w:tblStyle w:val="Tabellenraster"/>
@@ -3261,7 +3428,7 @@
 </file>
 
 <file path=word/styles.xml><?xml version="1.0" encoding="utf-8"?>
-<w:styles xmlns:mc="http://schemas.openxmlformats.org/markup-compatibility/2006" xmlns:r="http://schemas.openxmlformats.org/officeDocument/2006/relationships" xmlns:w="http://schemas.openxmlformats.org/wordprocessingml/2006/main" xmlns:w14="http://schemas.microsoft.com/office/word/2010/wordml" xmlns:w15="http://schemas.microsoft.com/office/word/2012/wordml" xmlns:w16cex="http://schemas.microsoft.com/office/word/2018/wordml/cex" xmlns:w16cid="http://schemas.microsoft.com/office/word/2016/wordml/cid" xmlns:w16="http://schemas.microsoft.com/office/word/2018/wordml" xmlns:w16du="http://schemas.microsoft.com/office/word/2023/wordml/word16du" xmlns:w16sdtdh="http://schemas.microsoft.com/office/word/2020/wordml/sdtdatahash" xmlns:w16sdtfl="http://schemas.microsoft.com/office/word/2024/wordml/sdtformatlock" xmlns:w16se="http://schemas.microsoft.com/office/word/2015/wordml/symex" mc:Ignorable="w14 w15 w16se w16cid w16 w16cex w16sdtdh w16sdtfl w16du">
+<w:styles xmlns:mc="http://schemas.openxmlformats.org/markup-compatibility/2006" xmlns:r="http://schemas.openxmlformats.org/officeDocument/2006/relationships" xmlns:w="http://schemas.openxmlformats.org/wordprocessingml/2006/main" xmlns:w14="http://schemas.microsoft.com/office/word/2010/wordml" xmlns:w15="http://schemas.microsoft.com/office/word/2012/wordml" xmlns:w16cex="http://schemas.microsoft.com/office/word/2018/wordml/cex" xmlns:w16cid="http://schemas.microsoft.com/office/word/2016/wordml/cid" xmlns:w16="http://schemas.microsoft.com/office/word/2018/wordml" xmlns:w16sdtdh="http://schemas.microsoft.com/office/word/2020/wordml/sdtdatahash" xmlns:w16se="http://schemas.microsoft.com/office/word/2015/wordml/symex" mc:Ignorable="w14 w15 w16se w16cid w16 w16cex w16sdtdh">
   <w:docDefaults>
     <w:rPrDefault>
       <w:rPr>
@@ -3875,6 +4042,46 @@
       <w:u w:val="single"/>
     </w:rPr>
   </w:style>
+  <w:style w:type="paragraph" w:styleId="Funotentext">
+    <w:name w:val="footnote text"/>
+    <w:basedOn w:val="Standard"/>
+    <w:link w:val="FunotentextZchn"/>
+    <w:uiPriority w:val="99"/>
+    <w:semiHidden/>
+    <w:unhideWhenUsed/>
+    <w:rsid w:val="00C84A05"/>
+    <w:pPr>
+      <w:spacing w:line="240" w:lineRule="auto"/>
+    </w:pPr>
+    <w:rPr>
+      <w:sz w:val="20"/>
+      <w:szCs w:val="20"/>
+    </w:rPr>
+  </w:style>
+  <w:style w:type="character" w:customStyle="1" w:styleId="FunotentextZchn">
+    <w:name w:val="Fußnotentext Zchn"/>
+    <w:basedOn w:val="Absatz-Standardschriftart"/>
+    <w:link w:val="Funotentext"/>
+    <w:uiPriority w:val="99"/>
+    <w:semiHidden/>
+    <w:rsid w:val="00C84A05"/>
+    <w:rPr>
+      <w:rFonts w:ascii="Aptos" w:hAnsi="Aptos"/>
+      <w:sz w:val="20"/>
+      <w:szCs w:val="20"/>
+    </w:rPr>
+  </w:style>
+  <w:style w:type="character" w:styleId="Funotenzeichen">
+    <w:name w:val="footnote reference"/>
+    <w:basedOn w:val="Absatz-Standardschriftart"/>
+    <w:uiPriority w:val="99"/>
+    <w:semiHidden/>
+    <w:unhideWhenUsed/>
+    <w:rsid w:val="00C84A05"/>
+    <w:rPr>
+      <w:vertAlign w:val="superscript"/>
+    </w:rPr>
+  </w:style>
 </w:styles>
 </file>
 

</xml_diff>